<commit_message>
Migrate data layer to Supabase: async storage.js, DB-backed auth, per-page async loading, project memory file
Co-Authored-By: Claude Opus 4.8 <noreply@anthropic.com>
</commit_message>
<xml_diff>
--- a/surat.docx
+++ b/surat.docx
@@ -69,51 +69,6 @@
           <w:u w:val="single"/>
         </w:rPr>
         <w:t>BAHAN HABIS PAKAI</w:t>
-      </w:r>
-    </w:p>
-    <w:p>
-      <w:pPr>
-        <w:spacing w:line="23" w:lineRule="atLeast"/>
-        <w:jc w:val="center"/>
-        <w:rPr>
-          <w:rFonts w:cs="Times New Roman"/>
-        </w:rPr>
-      </w:pPr>
-      <w:proofErr w:type="spellStart"/>
-      <w:proofErr w:type="gramStart"/>
-      <w:r>
-        <w:rPr>
-          <w:rFonts w:cs="Times New Roman"/>
-        </w:rPr>
-        <w:t>Nomor</w:t>
-      </w:r>
-      <w:proofErr w:type="spellEnd"/>
-      <w:r>
-        <w:rPr>
-          <w:rFonts w:cs="Times New Roman"/>
-        </w:rPr>
-        <w:t xml:space="preserve"> :</w:t>
-      </w:r>
-      <w:proofErr w:type="gramEnd"/>
-      <w:r>
-        <w:rPr>
-          <w:rFonts w:cs="Times New Roman"/>
-        </w:rPr>
-        <w:t xml:space="preserve"> ......../</w:t>
-      </w:r>
-      <w:proofErr w:type="gramStart"/>
-      <w:r>
-        <w:rPr>
-          <w:rFonts w:cs="Times New Roman"/>
-        </w:rPr>
-        <w:t>.....</w:t>
-      </w:r>
-      <w:proofErr w:type="gramEnd"/>
-      <w:r>
-        <w:rPr>
-          <w:rFonts w:cs="Times New Roman"/>
-        </w:rPr>
-        <w:t>/......../20....</w:t>
       </w:r>
     </w:p>
     <w:p>
@@ -124,111 +79,6 @@
     <w:p>
       <w:pPr>
         <w:spacing w:line="23" w:lineRule="atLeast"/>
-        <w:rPr>
-          <w:rFonts w:cs="Times New Roman"/>
-        </w:rPr>
-      </w:pPr>
-      <w:proofErr w:type="spellStart"/>
-      <w:r>
-        <w:rPr>
-          <w:rFonts w:cs="Times New Roman"/>
-        </w:rPr>
-        <w:t>Yth</w:t>
-      </w:r>
-      <w:proofErr w:type="spellEnd"/>
-      <w:r>
-        <w:rPr>
-          <w:rFonts w:cs="Times New Roman"/>
-        </w:rPr>
-        <w:t xml:space="preserve">. </w:t>
-      </w:r>
-      <w:proofErr w:type="spellStart"/>
-      <w:r>
-        <w:rPr>
-          <w:rFonts w:cs="Times New Roman"/>
-        </w:rPr>
-        <w:t>Kepala</w:t>
-      </w:r>
-      <w:proofErr w:type="spellEnd"/>
-      <w:r>
-        <w:rPr>
-          <w:rFonts w:cs="Times New Roman"/>
-        </w:rPr>
-        <w:t xml:space="preserve"> </w:t>
-      </w:r>
-      <w:proofErr w:type="spellStart"/>
-      <w:r>
-        <w:rPr>
-          <w:rFonts w:cs="Times New Roman"/>
-        </w:rPr>
-        <w:t>Laboratorium</w:t>
-      </w:r>
-      <w:proofErr w:type="spellEnd"/>
-      <w:r>
-        <w:rPr>
-          <w:rFonts w:cs="Times New Roman"/>
-        </w:rPr>
-        <w:t xml:space="preserve"> ..............................................</w:t>
-      </w:r>
-    </w:p>
-    <w:p>
-      <w:pPr>
-        <w:spacing w:line="23" w:lineRule="atLeast"/>
-        <w:rPr>
-          <w:rFonts w:cs="Times New Roman"/>
-        </w:rPr>
-      </w:pPr>
-      <w:proofErr w:type="spellStart"/>
-      <w:r>
-        <w:rPr>
-          <w:rFonts w:cs="Times New Roman"/>
-        </w:rPr>
-        <w:t>Politeknik</w:t>
-      </w:r>
-      <w:proofErr w:type="spellEnd"/>
-      <w:r>
-        <w:rPr>
-          <w:rFonts w:cs="Times New Roman"/>
-        </w:rPr>
-        <w:t xml:space="preserve"> Negeri </w:t>
-      </w:r>
-      <w:proofErr w:type="spellStart"/>
-      <w:r>
-        <w:rPr>
-          <w:rFonts w:cs="Times New Roman"/>
-        </w:rPr>
-        <w:t>Bengkalis</w:t>
-      </w:r>
-      <w:proofErr w:type="spellEnd"/>
-    </w:p>
-    <w:p>
-      <w:pPr>
-        <w:spacing w:line="23" w:lineRule="atLeast"/>
-        <w:rPr>
-          <w:rFonts w:cs="Times New Roman"/>
-        </w:rPr>
-      </w:pPr>
-      <w:r>
-        <w:rPr>
-          <w:rFonts w:cs="Times New Roman"/>
-        </w:rPr>
-        <w:t xml:space="preserve">di </w:t>
-      </w:r>
-      <w:proofErr w:type="spellStart"/>
-      <w:r>
-        <w:rPr>
-          <w:rFonts w:cs="Times New Roman"/>
-        </w:rPr>
-        <w:t>Bengkalis</w:t>
-      </w:r>
-      <w:proofErr w:type="spellEnd"/>
-    </w:p>
-    <w:p>
-      <w:pPr>
-        <w:spacing w:line="23" w:lineRule="atLeast"/>
-        <w:rPr>
-          <w:rFonts w:cs="Times New Roman"/>
-        </w:rPr>
       </w:pPr>
     </w:p>
     <w:p>
@@ -243,7 +93,7 @@
         <w:rPr>
           <w:rFonts w:cs="Times New Roman"/>
         </w:rPr>
-        <w:t>Dengan</w:t>
+        <w:t>Kepada</w:t>
       </w:r>
       <w:proofErr w:type="spellEnd"/>
       <w:r>
@@ -251,25 +101,106 @@
           <w:rFonts w:cs="Times New Roman"/>
         </w:rPr>
         <w:t xml:space="preserve"> </w:t>
-      </w:r>
-      <w:proofErr w:type="spellStart"/>
-      <w:r>
-        <w:rPr>
-          <w:rFonts w:cs="Times New Roman"/>
-        </w:rPr>
-        <w:t>hormat</w:t>
-      </w:r>
-      <w:proofErr w:type="spellEnd"/>
-      <w:r>
-        <w:rPr>
-          <w:rFonts w:cs="Times New Roman"/>
-        </w:rPr>
-        <w:t>,</w:t>
       </w:r>
     </w:p>
     <w:p>
       <w:pPr>
         <w:spacing w:line="23" w:lineRule="atLeast"/>
+        <w:rPr>
+          <w:rFonts w:cs="Times New Roman"/>
+        </w:rPr>
+      </w:pPr>
+      <w:proofErr w:type="spellStart"/>
+      <w:r>
+        <w:rPr>
+          <w:rFonts w:cs="Times New Roman"/>
+        </w:rPr>
+        <w:t>Kepala</w:t>
+      </w:r>
+      <w:proofErr w:type="spellEnd"/>
+      <w:r>
+        <w:rPr>
+          <w:rFonts w:cs="Times New Roman"/>
+        </w:rPr>
+        <w:t xml:space="preserve"> </w:t>
+      </w:r>
+      <w:r>
+        <w:rPr>
+          <w:rFonts w:cs="Times New Roman"/>
+        </w:rPr>
+        <w:t>..............................................</w:t>
+      </w:r>
+    </w:p>
+    <w:p>
+      <w:pPr>
+        <w:spacing w:line="23" w:lineRule="atLeast"/>
+        <w:rPr>
+          <w:rFonts w:cs="Times New Roman"/>
+        </w:rPr>
+      </w:pPr>
+      <w:r>
+        <w:rPr>
+          <w:rFonts w:cs="Times New Roman"/>
+        </w:rPr>
+        <w:t xml:space="preserve">Di </w:t>
+      </w:r>
+      <w:proofErr w:type="spellStart"/>
+      <w:r>
+        <w:rPr>
+          <w:rFonts w:cs="Times New Roman"/>
+        </w:rPr>
+        <w:t>Tempat</w:t>
+      </w:r>
+      <w:proofErr w:type="spellEnd"/>
+    </w:p>
+    <w:p>
+      <w:pPr>
+        <w:spacing w:line="23" w:lineRule="atLeast"/>
+        <w:rPr>
+          <w:rFonts w:cs="Times New Roman"/>
+        </w:rPr>
+      </w:pPr>
+    </w:p>
+    <w:p>
+      <w:pPr>
+        <w:spacing w:line="23" w:lineRule="atLeast"/>
+        <w:rPr>
+          <w:rFonts w:cs="Times New Roman"/>
+        </w:rPr>
+      </w:pPr>
+      <w:proofErr w:type="spellStart"/>
+      <w:r>
+        <w:rPr>
+          <w:rFonts w:cs="Times New Roman"/>
+        </w:rPr>
+        <w:t>Dengan</w:t>
+      </w:r>
+      <w:proofErr w:type="spellEnd"/>
+      <w:r>
+        <w:rPr>
+          <w:rFonts w:cs="Times New Roman"/>
+        </w:rPr>
+        <w:t xml:space="preserve"> </w:t>
+      </w:r>
+      <w:proofErr w:type="spellStart"/>
+      <w:r>
+        <w:rPr>
+          <w:rFonts w:cs="Times New Roman"/>
+        </w:rPr>
+        <w:t>hormat</w:t>
+      </w:r>
+      <w:proofErr w:type="spellEnd"/>
+      <w:r>
+        <w:rPr>
+          <w:rFonts w:cs="Times New Roman"/>
+        </w:rPr>
+        <w:t>,</w:t>
+      </w:r>
+    </w:p>
+    <w:p>
+      <w:pPr>
+        <w:spacing w:line="23" w:lineRule="atLeast"/>
+        <w:ind w:firstLine="567"/>
         <w:rPr>
           <w:rFonts w:cs="Times New Roman"/>
         </w:rPr>
@@ -341,6 +272,7 @@
       <w:tblPr>
         <w:tblStyle w:val="TableGrid"/>
         <w:tblW w:w="0" w:type="auto"/>
+        <w:tblInd w:w="567" w:type="dxa"/>
         <w:tblBorders>
           <w:top w:val="none" w:sz="4" w:space="0" w:color="auto"/>
           <w:left w:val="none" w:sz="4" w:space="0" w:color="auto"/>
@@ -352,18 +284,19 @@
         <w:tblLook w:val="04A0" w:firstRow="1" w:lastRow="0" w:firstColumn="1" w:lastColumn="0" w:noHBand="0" w:noVBand="1"/>
       </w:tblPr>
       <w:tblGrid>
-        <w:gridCol w:w="2783"/>
+        <w:gridCol w:w="2216"/>
         <w:gridCol w:w="2521"/>
         <w:gridCol w:w="4056"/>
       </w:tblGrid>
       <w:tr>
         <w:tc>
           <w:tcPr>
-            <w:tcW w:w="3116" w:type="dxa"/>
-          </w:tcPr>
-          <w:p>
-            <w:pPr>
-              <w:spacing w:line="23" w:lineRule="atLeast"/>
+            <w:tcW w:w="2216" w:type="dxa"/>
+          </w:tcPr>
+          <w:p>
+            <w:pPr>
+              <w:spacing w:line="23" w:lineRule="atLeast"/>
+              <w:ind w:left="-113"/>
               <w:rPr>
                 <w:rFonts w:cs="Times New Roman"/>
               </w:rPr>
@@ -378,7 +311,7 @@
         </w:tc>
         <w:tc>
           <w:tcPr>
-            <w:tcW w:w="3117" w:type="dxa"/>
+            <w:tcW w:w="2521" w:type="dxa"/>
           </w:tcPr>
           <w:p>
             <w:pPr>
@@ -397,7 +330,7 @@
         </w:tc>
         <w:tc>
           <w:tcPr>
-            <w:tcW w:w="3117" w:type="dxa"/>
+            <w:tcW w:w="4056" w:type="dxa"/>
           </w:tcPr>
           <w:p>
             <w:pPr>
@@ -418,11 +351,12 @@
       <w:tr>
         <w:tc>
           <w:tcPr>
-            <w:tcW w:w="3116" w:type="dxa"/>
-          </w:tcPr>
-          <w:p>
-            <w:pPr>
-              <w:spacing w:line="23" w:lineRule="atLeast"/>
+            <w:tcW w:w="2216" w:type="dxa"/>
+          </w:tcPr>
+          <w:p>
+            <w:pPr>
+              <w:spacing w:line="23" w:lineRule="atLeast"/>
+              <w:ind w:left="-113"/>
               <w:rPr>
                 <w:rFonts w:cs="Times New Roman"/>
               </w:rPr>
@@ -437,7 +371,7 @@
         </w:tc>
         <w:tc>
           <w:tcPr>
-            <w:tcW w:w="3117" w:type="dxa"/>
+            <w:tcW w:w="2521" w:type="dxa"/>
           </w:tcPr>
           <w:p>
             <w:pPr>
@@ -456,7 +390,7 @@
         </w:tc>
         <w:tc>
           <w:tcPr>
-            <w:tcW w:w="3117" w:type="dxa"/>
+            <w:tcW w:w="4056" w:type="dxa"/>
           </w:tcPr>
           <w:p>
             <w:pPr>
@@ -477,15 +411,22 @@
       <w:tr>
         <w:tc>
           <w:tcPr>
-            <w:tcW w:w="3116" w:type="dxa"/>
-          </w:tcPr>
-          <w:p>
-            <w:pPr>
-              <w:spacing w:line="23" w:lineRule="atLeast"/>
-              <w:rPr>
-                <w:rFonts w:cs="Times New Roman"/>
-              </w:rPr>
-            </w:pPr>
+            <w:tcW w:w="2216" w:type="dxa"/>
+          </w:tcPr>
+          <w:p>
+            <w:pPr>
+              <w:spacing w:line="23" w:lineRule="atLeast"/>
+              <w:ind w:left="-113"/>
+              <w:rPr>
+                <w:rFonts w:cs="Times New Roman"/>
+              </w:rPr>
+            </w:pPr>
+            <w:r>
+              <w:rPr>
+                <w:rFonts w:cs="Times New Roman"/>
+              </w:rPr>
+              <w:t>Prodi/</w:t>
+            </w:r>
             <w:proofErr w:type="spellStart"/>
             <w:r>
               <w:rPr>
@@ -498,7 +439,7 @@
         </w:tc>
         <w:tc>
           <w:tcPr>
-            <w:tcW w:w="3117" w:type="dxa"/>
+            <w:tcW w:w="2521" w:type="dxa"/>
           </w:tcPr>
           <w:p>
             <w:pPr>
@@ -517,7 +458,7 @@
         </w:tc>
         <w:tc>
           <w:tcPr>
-            <w:tcW w:w="3117" w:type="dxa"/>
+            <w:tcW w:w="4056" w:type="dxa"/>
           </w:tcPr>
           <w:p>
             <w:pPr>
@@ -538,11 +479,12 @@
       <w:tr>
         <w:tc>
           <w:tcPr>
-            <w:tcW w:w="3116" w:type="dxa"/>
-          </w:tcPr>
-          <w:p>
-            <w:pPr>
-              <w:spacing w:line="23" w:lineRule="atLeast"/>
+            <w:tcW w:w="2216" w:type="dxa"/>
+          </w:tcPr>
+          <w:p>
+            <w:pPr>
+              <w:spacing w:line="23" w:lineRule="atLeast"/>
+              <w:ind w:left="-113"/>
               <w:rPr>
                 <w:rFonts w:cs="Times New Roman"/>
               </w:rPr>
@@ -559,7 +501,7 @@
         </w:tc>
         <w:tc>
           <w:tcPr>
-            <w:tcW w:w="3117" w:type="dxa"/>
+            <w:tcW w:w="2521" w:type="dxa"/>
           </w:tcPr>
           <w:p>
             <w:pPr>
@@ -578,7 +520,7 @@
         </w:tc>
         <w:tc>
           <w:tcPr>
-            <w:tcW w:w="3117" w:type="dxa"/>
+            <w:tcW w:w="4056" w:type="dxa"/>
           </w:tcPr>
           <w:p>
             <w:pPr>
@@ -1385,6 +1327,7 @@
     <w:p>
       <w:pPr>
         <w:spacing w:line="23" w:lineRule="atLeast"/>
+        <w:ind w:firstLine="567"/>
         <w:jc w:val="both"/>
         <w:rPr>
           <w:rFonts w:cs="Times New Roman"/>
@@ -1547,6 +1490,11 @@
         </w:rPr>
         <w:t>, ................................ 20....</w:t>
       </w:r>
+    </w:p>
+    <w:p>
+      <w:pPr>
+        <w:spacing w:line="23" w:lineRule="atLeast"/>
+      </w:pPr>
     </w:p>
     <w:p>
       <w:pPr>
@@ -1829,51 +1777,6 @@
     <w:p>
       <w:pPr>
         <w:spacing w:line="23" w:lineRule="atLeast"/>
-        <w:jc w:val="center"/>
-        <w:rPr>
-          <w:rFonts w:cs="Times New Roman"/>
-        </w:rPr>
-      </w:pPr>
-      <w:proofErr w:type="spellStart"/>
-      <w:proofErr w:type="gramStart"/>
-      <w:r>
-        <w:rPr>
-          <w:rFonts w:cs="Times New Roman"/>
-        </w:rPr>
-        <w:t>Nomor</w:t>
-      </w:r>
-      <w:proofErr w:type="spellEnd"/>
-      <w:r>
-        <w:rPr>
-          <w:rFonts w:cs="Times New Roman"/>
-        </w:rPr>
-        <w:t xml:space="preserve"> :</w:t>
-      </w:r>
-      <w:proofErr w:type="gramEnd"/>
-      <w:r>
-        <w:rPr>
-          <w:rFonts w:cs="Times New Roman"/>
-        </w:rPr>
-        <w:t xml:space="preserve"> ......../</w:t>
-      </w:r>
-      <w:proofErr w:type="gramStart"/>
-      <w:r>
-        <w:rPr>
-          <w:rFonts w:cs="Times New Roman"/>
-        </w:rPr>
-        <w:t>.....</w:t>
-      </w:r>
-      <w:proofErr w:type="gramEnd"/>
-      <w:r>
-        <w:rPr>
-          <w:rFonts w:cs="Times New Roman"/>
-        </w:rPr>
-        <w:t>/......../20....</w:t>
-      </w:r>
-    </w:p>
-    <w:p>
-      <w:pPr>
-        <w:spacing w:line="23" w:lineRule="atLeast"/>
         <w:rPr>
           <w:rFonts w:cs="Times New Roman"/>
         </w:rPr>
@@ -1886,48 +1789,6 @@
           <w:rFonts w:cs="Times New Roman"/>
         </w:rPr>
       </w:pPr>
-      <w:proofErr w:type="spellStart"/>
-      <w:r>
-        <w:rPr>
-          <w:rFonts w:cs="Times New Roman"/>
-        </w:rPr>
-        <w:t>Yth</w:t>
-      </w:r>
-      <w:proofErr w:type="spellEnd"/>
-      <w:r>
-        <w:rPr>
-          <w:rFonts w:cs="Times New Roman"/>
-        </w:rPr>
-        <w:t xml:space="preserve">. </w:t>
-      </w:r>
-      <w:proofErr w:type="spellStart"/>
-      <w:r>
-        <w:rPr>
-          <w:rFonts w:cs="Times New Roman"/>
-        </w:rPr>
-        <w:t>Kepala</w:t>
-      </w:r>
-      <w:proofErr w:type="spellEnd"/>
-      <w:r>
-        <w:rPr>
-          <w:rFonts w:cs="Times New Roman"/>
-        </w:rPr>
-        <w:t xml:space="preserve"> </w:t>
-      </w:r>
-      <w:proofErr w:type="spellStart"/>
-      <w:r>
-        <w:rPr>
-          <w:rFonts w:cs="Times New Roman"/>
-        </w:rPr>
-        <w:t>Laboratorium</w:t>
-      </w:r>
-      <w:proofErr w:type="spellEnd"/>
-      <w:r>
-        <w:rPr>
-          <w:rFonts w:cs="Times New Roman"/>
-        </w:rPr>
-        <w:t xml:space="preserve"> ..............................................</w:t>
-      </w:r>
     </w:p>
     <w:p>
       <w:pPr>
@@ -1941,23 +1802,15 @@
         <w:rPr>
           <w:rFonts w:cs="Times New Roman"/>
         </w:rPr>
-        <w:t>Politeknik</w:t>
-      </w:r>
-      <w:proofErr w:type="spellEnd"/>
-      <w:r>
-        <w:rPr>
-          <w:rFonts w:cs="Times New Roman"/>
-        </w:rPr>
-        <w:t xml:space="preserve"> Negeri </w:t>
-      </w:r>
-      <w:proofErr w:type="spellStart"/>
-      <w:r>
-        <w:rPr>
-          <w:rFonts w:cs="Times New Roman"/>
-        </w:rPr>
-        <w:t>Bengkalis</w:t>
-      </w:r>
-      <w:proofErr w:type="spellEnd"/>
+        <w:t>Kepada</w:t>
+      </w:r>
+      <w:proofErr w:type="spellEnd"/>
+      <w:r>
+        <w:rPr>
+          <w:rFonts w:cs="Times New Roman"/>
+        </w:rPr>
+        <w:t xml:space="preserve"> </w:t>
+      </w:r>
     </w:p>
     <w:p>
       <w:pPr>
@@ -1966,18 +1819,46 @@
           <w:rFonts w:cs="Times New Roman"/>
         </w:rPr>
       </w:pPr>
-      <w:r>
-        <w:rPr>
-          <w:rFonts w:cs="Times New Roman"/>
-        </w:rPr>
-        <w:t xml:space="preserve">di </w:t>
-      </w:r>
-      <w:proofErr w:type="spellStart"/>
-      <w:r>
-        <w:rPr>
-          <w:rFonts w:cs="Times New Roman"/>
-        </w:rPr>
-        <w:t>Bengkalis</w:t>
+      <w:proofErr w:type="spellStart"/>
+      <w:r>
+        <w:rPr>
+          <w:rFonts w:cs="Times New Roman"/>
+        </w:rPr>
+        <w:t>Kepala</w:t>
+      </w:r>
+      <w:proofErr w:type="spellEnd"/>
+      <w:r>
+        <w:rPr>
+          <w:rFonts w:cs="Times New Roman"/>
+        </w:rPr>
+        <w:t xml:space="preserve"> </w:t>
+      </w:r>
+      <w:r>
+        <w:rPr>
+          <w:rFonts w:cs="Times New Roman"/>
+        </w:rPr>
+        <w:t>..............................................</w:t>
+      </w:r>
+    </w:p>
+    <w:p>
+      <w:pPr>
+        <w:spacing w:line="23" w:lineRule="atLeast"/>
+        <w:rPr>
+          <w:rFonts w:cs="Times New Roman"/>
+        </w:rPr>
+      </w:pPr>
+      <w:r>
+        <w:rPr>
+          <w:rFonts w:cs="Times New Roman"/>
+        </w:rPr>
+        <w:t xml:space="preserve">Di </w:t>
+      </w:r>
+      <w:proofErr w:type="spellStart"/>
+      <w:r>
+        <w:rPr>
+          <w:rFonts w:cs="Times New Roman"/>
+        </w:rPr>
+        <w:t>Tempat</w:t>
       </w:r>
       <w:proofErr w:type="spellEnd"/>
     </w:p>
@@ -1992,6 +1873,7 @@
     <w:p>
       <w:pPr>
         <w:spacing w:line="23" w:lineRule="atLeast"/>
+        <w:ind w:firstLine="567"/>
         <w:rPr>
           <w:rFonts w:cs="Times New Roman"/>
         </w:rPr>
@@ -2028,6 +1910,7 @@
     <w:p>
       <w:pPr>
         <w:spacing w:line="23" w:lineRule="atLeast"/>
+        <w:ind w:firstLine="567"/>
         <w:rPr>
           <w:rFonts w:cs="Times New Roman"/>
         </w:rPr>
@@ -2099,6 +1982,7 @@
       <w:tblPr>
         <w:tblStyle w:val="TableGrid"/>
         <w:tblW w:w="0" w:type="auto"/>
+        <w:tblInd w:w="567" w:type="dxa"/>
         <w:tblBorders>
           <w:top w:val="none" w:sz="4" w:space="0" w:color="auto"/>
           <w:left w:val="none" w:sz="4" w:space="0" w:color="auto"/>
@@ -2110,18 +1994,19 @@
         <w:tblLook w:val="04A0" w:firstRow="1" w:lastRow="0" w:firstColumn="1" w:lastColumn="0" w:noHBand="0" w:noVBand="1"/>
       </w:tblPr>
       <w:tblGrid>
-        <w:gridCol w:w="2783"/>
-        <w:gridCol w:w="2521"/>
+        <w:gridCol w:w="2202"/>
+        <w:gridCol w:w="2535"/>
         <w:gridCol w:w="4056"/>
       </w:tblGrid>
       <w:tr>
         <w:tc>
           <w:tcPr>
-            <w:tcW w:w="3116" w:type="dxa"/>
-          </w:tcPr>
-          <w:p>
-            <w:pPr>
-              <w:spacing w:line="23" w:lineRule="atLeast"/>
+            <w:tcW w:w="2202" w:type="dxa"/>
+          </w:tcPr>
+          <w:p>
+            <w:pPr>
+              <w:spacing w:line="23" w:lineRule="atLeast"/>
+              <w:ind w:left="-109"/>
               <w:rPr>
                 <w:rFonts w:cs="Times New Roman"/>
               </w:rPr>
@@ -2136,7 +2021,7 @@
         </w:tc>
         <w:tc>
           <w:tcPr>
-            <w:tcW w:w="3117" w:type="dxa"/>
+            <w:tcW w:w="2535" w:type="dxa"/>
           </w:tcPr>
           <w:p>
             <w:pPr>
@@ -2155,7 +2040,7 @@
         </w:tc>
         <w:tc>
           <w:tcPr>
-            <w:tcW w:w="3117" w:type="dxa"/>
+            <w:tcW w:w="4056" w:type="dxa"/>
           </w:tcPr>
           <w:p>
             <w:pPr>
@@ -2176,11 +2061,12 @@
       <w:tr>
         <w:tc>
           <w:tcPr>
-            <w:tcW w:w="3116" w:type="dxa"/>
-          </w:tcPr>
-          <w:p>
-            <w:pPr>
-              <w:spacing w:line="23" w:lineRule="atLeast"/>
+            <w:tcW w:w="2202" w:type="dxa"/>
+          </w:tcPr>
+          <w:p>
+            <w:pPr>
+              <w:spacing w:line="23" w:lineRule="atLeast"/>
+              <w:ind w:left="-109"/>
               <w:rPr>
                 <w:rFonts w:cs="Times New Roman"/>
               </w:rPr>
@@ -2197,7 +2083,7 @@
         </w:tc>
         <w:tc>
           <w:tcPr>
-            <w:tcW w:w="3117" w:type="dxa"/>
+            <w:tcW w:w="2535" w:type="dxa"/>
           </w:tcPr>
           <w:p>
             <w:pPr>
@@ -2216,7 +2102,7 @@
         </w:tc>
         <w:tc>
           <w:tcPr>
-            <w:tcW w:w="3117" w:type="dxa"/>
+            <w:tcW w:w="4056" w:type="dxa"/>
           </w:tcPr>
           <w:p>
             <w:pPr>
@@ -3023,6 +2909,7 @@
     <w:p>
       <w:pPr>
         <w:spacing w:line="23" w:lineRule="atLeast"/>
+        <w:ind w:firstLine="567"/>
         <w:jc w:val="both"/>
         <w:rPr>
           <w:rFonts w:cs="Times New Roman"/>
@@ -3269,9 +3156,6 @@
               <w:spacing w:line="23" w:lineRule="atLeast"/>
               <w:jc w:val="center"/>
             </w:pPr>
-            <w:r>
-              <w:t>NIP. ...............................</w:t>
-            </w:r>
           </w:p>
           <w:p>
             <w:pPr>
@@ -4142,6 +4026,7 @@
   <w:style w:type="paragraph" w:default="1" w:styleId="Normal">
     <w:name w:val="Normal"/>
     <w:qFormat/>
+    <w:rsid w:val="00D646E0"/>
   </w:style>
   <w:style w:type="paragraph" w:styleId="Heading1">
     <w:name w:val="heading 1"/>
@@ -4211,6 +4096,7 @@
   <w:style w:type="character" w:default="1" w:styleId="DefaultParagraphFont">
     <w:name w:val="Default Paragraph Font"/>
     <w:uiPriority w:val="1"/>
+    <w:semiHidden/>
     <w:unhideWhenUsed/>
   </w:style>
   <w:style w:type="table" w:default="1" w:styleId="TableNormal">

</xml_diff>